<commit_message>
Redesign CRM Figure 1 protocol schematic
</commit_message>
<xml_diff>
--- a/manuscript/CRM_MANUSCRIPT_v1.5.docx
+++ b/manuscript/CRM_MANUSCRIPT_v1.5.docx
@@ -112,7 +112,7 @@
     </w:p>
     <w:p>
       <w:r>
-        <w:t>VirtualPerturb-Audit evaluates perturbation-response predictions through five stages: input freeze, global-fit audit, perturbation-specific audit, falsification audit, and transfer/unsupported-effect audit (Figure 1; Table 1). Stage 1 freezes the dataset version, target universe, gene universe, model checkpoint, split assignments, preprocessing, and evaluation code. Stage 2 reports global-fit metrics, explicitly separating raw-space Pearson from audit-delta Pearson. Stage 3 asks whether the true perturbation is retrieved from a candidate universe. Stage 4 applies baselines and probe controls that remove or scramble target-specific information. Stage 5 evaluates matched-target context transfer, unsupported-effect rate (UER@K), and sign-flip rate.</w:t>
+        <w:t>VirtualPerturb-Audit evaluates perturbation-response predictions through five linked components: input and provenance freeze, global-fit audit, perturbation-specific audit, falsification audit, and transfer and error-burden audit (Figure 1; Table 1). The input and provenance freeze locks the dataset version, target universe, gene universe, model checkpoint, split assignments, preprocessing, and evaluation code. The global-fit audit reports raw-space and audit-delta agreement as noninterchangeable metric spaces. The perturbation-specific audit asks whether the true perturbation is retrieved from a candidate universe. The falsification audit applies baselines and probe controls that remove or scramble target-specific information. The transfer and error-burden audit evaluates matched-target context transfer, unsupported-effect rate (UER@K), and sign-flip rate.</w:t>
       </w:r>
     </w:p>
     <w:p>
@@ -250,7 +250,7 @@
                 <w:rFonts w:ascii="Arial" w:hAnsi="Arial"/>
                 <w:sz w:val="14"/>
               </w:rPr>
-              <w:t>Input freeze</w:t>
+              <w:t>Input and provenance freeze</w:t>
             </w:r>
           </w:p>
         </w:tc>
@@ -618,7 +618,7 @@
                 <w:rFonts w:ascii="Arial" w:hAnsi="Arial"/>
                 <w:sz w:val="14"/>
               </w:rPr>
-              <w:t>Transfer and unsupported-effect audit</w:t>
+              <w:t>Transfer and error-burden audit</w:t>
             </w:r>
           </w:p>
         </w:tc>
@@ -895,7 +895,7 @@
     </w:p>
     <w:p>
       <w:r>
-        <w:t>VirtualPerturb-Audit contains five stages. Stage 1 freezes expression data, perturbation labels, control labels, context labels, model predictions, split assignments, dataset version, target universe, gene universe, model checkpoint, preprocessing, and evaluation code. Stage 2 computes global-fit endpoints, including raw-space Pearson, audit-delta Pearson, Spearman, RMSE, MAE, and cosine. Stage 3 computes perturbation-specific retrieval using Top1, Top5, and MRR. Stage 4 applies baselines and falsification probes B0-B5 and FP1-FP3. Stage 5 evaluates context holdout, matched-target transfer, UER@K, and sign-flip rate.</w:t>
+        <w:t>VirtualPerturb-Audit contains five linked components. Input and provenance freeze records expression data, perturbation labels, control labels, context labels, model predictions, split assignments, dataset version, target universe, gene universe, model checkpoint, preprocessing, and evaluation code. The global-fit audit computes raw-space Pearson, audit-delta Pearson, Spearman, RMSE, MAE, and cosine. The perturbation-specific audit computes retrieval using Top1, Top5, and MRR. The falsification audit applies baselines and falsification probes B0-B5 and FP1-FP3. The transfer and error-burden audit evaluates context holdout, matched-target transfer, UER@K, and sign-flip rate.</w:t>
       </w:r>
     </w:p>
     <w:p>
@@ -1340,7 +1340,7 @@
     </w:p>
     <w:p>
       <w:r>
-        <w:t>Figure 1. VirtualPerturb-Audit protocol. Frozen datasets, predictions, split assignments, and preprocessing enter a five-stage audit that separates input freeze, global fit, perturbation-specific retrieval, falsification probes, and matched transfer/unsupported-effect testing. The figure emphasizes method identity and claim boundaries rather than model ranking.</w:t>
+        <w:t>Figure 1. VirtualPerturb-Audit protocol. VirtualPerturb-Audit accepts observed perturbation responses, model predictions, controls, perturbation and context labels, and frozen analysis provenance. The framework separately evaluates global expression agreement, perturbation-specific retrieval, falsification probes, matched-target context transfer, and unsupported or directional effects. Results are translated into endpoint-specific claim boundaries rather than a single model score. The schematic depicts the general framework and does not represent a direct GEARS-versus-STATE ranking.</w:t>
       </w:r>
     </w:p>
     <w:p>

</xml_diff>

<commit_message>
Redesign CRM Figure 2 endpoint divergence plot
</commit_message>
<xml_diff>
--- a/manuscript/CRM_MANUSCRIPT_v1.5.docx
+++ b/manuscript/CRM_MANUSCRIPT_v1.5.docx
@@ -709,7 +709,7 @@
     </w:p>
     <w:p>
       <w:r>
-        <w:t>Frozen GEARS analyses showed that aggregate similarity and perturbation-specific retrieval describe different behavior (Figure 2). Norman L1 GEARS had raw-space Pearson 0.9887 and mean reciprocal rank (MRR) 0.3277. Replogle K562 R-L1 retained high raw-space Pearson (0.9851) but had much lower MRR (0.0445). Replogle RPE1 R-L1 had raw-space Pearson 0.9709 and MRR 0.0209.</w:t>
+        <w:t>Frozen GEARS analyses showed that aggregate similarity and perturbation-specific retrieval describe different behavior when viewed as separate endpoint families (Figure 2). Norman L1 GEARS had raw-space Pearson 0.9887 and mean reciprocal rank (MRR) 0.3277. Replogle K562 R-L1 retained high raw-space Pearson (0.9851) but had much lower MRR (0.0445). Replogle RPE1 R-L1 had raw-space Pearson 0.9709 and MRR 0.0209.</w:t>
       </w:r>
     </w:p>
     <w:p>
@@ -1345,7 +1345,7 @@
     </w:p>
     <w:p>
       <w:r>
-        <w:t>Figure 2. Global expression agreement and perturbation retrieval diverge. GEARS raw-space Pearson and retrieval MRR are shown for frozen Norman and GEARS-compatible filtered Replogle within-context tasks. Pearson is raw expression Pearson in the GEARS output space. MRR measures perturbation-specific retrieval from the declared candidate universe.</w:t>
+        <w:t>Figure 2. High global expression agreement does not imply perturbation-specific retrieval. Raw-space Pearson agreement (A) and perturbation retrieval by mean reciprocal rank (MRR; B) are displayed separately for frozen Norman and GEARS-compatible filtered Replogle within-context tasks. The Pearson axis is restricted to resolve values that are uniformly close to one; dot positions rather than bar lengths encode estimates. Retrieval is evaluated within each task's declared non-control candidate universe, and candidate-set size should be considered when comparing absolute MRR values across tasks. Open markers indicate the theoretical expectation under random ranking for the corresponding candidate universe. These endpoint families quantify distinct properties: global transcriptomic agreement and perturbation identity recovery.</w:t>
       </w:r>
     </w:p>
     <w:p>

</xml_diff>

<commit_message>
Redesign CRM Figure 3 falsification probes
</commit_message>
<xml_diff>
--- a/manuscript/CRM_MANUSCRIPT_v1.5.docx
+++ b/manuscript/CRM_MANUSCRIPT_v1.5.docx
@@ -727,7 +727,7 @@
     </w:p>
     <w:p>
       <w:r>
-        <w:t>Within-context Replogle analyses compared GEARS against simple baselines and falsification probes (Figure 3). Mean-effect probes achieved substantial audit-delta Pearson in both K562 and RPE1, while retrieval remained low. GEARS showed modest improvements on some retrieval endpoints, but absolute retrieval remained limited.</w:t>
+        <w:t>Within-context Replogle analyses compared GEARS against target-information-restricted probes in the K562 and RPE1 R-L1 tasks (Figure 3). Mean-effect probes achieved substantial audit-delta Pearson in both contexts, and label-shuffled probes retained non-zero response agreement after perturbation labels were scrambled. GEARS showed higher retrieval within each context, but absolute retrieval remained limited.</w:t>
       </w:r>
     </w:p>
     <w:p>
@@ -1350,7 +1350,7 @@
     </w:p>
     <w:p>
       <w:r>
-        <w:t>Figure 3. Probe controls for within-context Replogle evaluation. GEARS, baselines, and falsification probes are compared on GEARS-compatible filtered Replogle K562 and RPE1 R-L1 tasks. Bars report audit-delta Pearson and retrieval MRR from frozen result tables. Probe performance narrows the supported interpretation of endpoints that can be approached without perturbation-specific information.</w:t>
+        <w:t>Figure 3. Falsification probes separate shared response agreement from perturbation-specific retrieval. Audit-delta Pearson (A) and perturbation retrieval by MRR (B) are shown for GEARS and target-information-restricted probes in GEARS-compatible filtered Replogle K562 and RPE1 within-context tasks. The mean-effect probe does not use perturbation-specific target identity at prediction time, and the label-shuffled probe disrupts that identity by scrambling perturbation labels. These probes retain non-zero or substantial response agreement, whereas GEARS shows higher retrieval within each context. The comparisons are diagnostic rather than a model leaderboard: survival of an endpoint after perturbation information is removed narrows its interpretation toward shared response structure rather than perturbation identity. Gray reference markers denote the theoretical expectation under random ranking for the corresponding candidate universe.</w:t>
       </w:r>
     </w:p>
     <w:p>

</xml_diff>

<commit_message>
Redesign CRM Figure 4 matched transfer plot
</commit_message>
<xml_diff>
--- a/manuscript/CRM_MANUSCRIPT_v1.5.docx
+++ b/manuscript/CRM_MANUSCRIPT_v1.5.docx
@@ -745,7 +745,7 @@
     </w:p>
     <w:p>
       <w:r>
-        <w:t>The strongest quantitative stress test came from matched-target GEARS transfer (Figure 4). In K562-to-RPE1 transfer, audit-delta Pearson decreased from 0.2812 within context to -0.0070 cross context. The paired drop was 0.2883, with a 95% interval of [0.2559, 0.3206]. UER50 increased from 0.1532 to 0.3877, and sign-flip rate increased from 0.2714 to 0.5718.</w:t>
+        <w:t>The strongest quantitative stress test came from matched-target GEARS transfer (Figure 4). In K562-to-RPE1 transfer, audit-delta Pearson decreased from 0.2812 within context to -0.0070 cross context. The paired drop was 0.2883, with a 95% interval of [0.2559, 0.3206]. Figure 4 focuses on this paired audit-delta Pearson decrement; secondary sensitivity endpoints also shifted in the worse cross-context direction, with UER50 increasing from 0.1532 to 0.3877 and sign-flip rate increasing from 0.2714 to 0.5718.</w:t>
       </w:r>
     </w:p>
     <w:p>
@@ -1355,7 +1355,7 @@
     </w:p>
     <w:p>
       <w:r>
-        <w:t>Figure 4. Matched-target GEARS context-transfer stress test. Shared-target analysis compares within-context and cross-context audit-delta Pearson for K562-to-RPE1 (n=150 matched targets) and RPE1-to-K562 (n=148 matched targets). Labels show paired drops and perturbation-level bootstrap 95% intervals. Figure 4 uses QC and matched-transfer language only.</w:t>
+        <w:t>Figure 4. Matched-target analysis reveals substantial GEARS context-transfer degradation. Audit-delta Pearson was compared between within-context and cross-context predictions using identical perturbation-target sets for K562-to-RPE1 (n=150) and RPE1-to-K562 (n=148) transfer. Target-level paired estimates and perturbation-level bootstrap 95% confidence intervals from 2,000 paired resamples are shown. Positive within-minus-cross differences indicate reduced cross-context response agreement. Matching reduces differences in target composition but does not isolate cellular context from model-, training-, or inference-specific contributors to transfer degradation.</w:t>
       </w:r>
     </w:p>
     <w:p>

</xml_diff>

<commit_message>
Redesign CRM Figure 5 endpoint heterogeneity plot
</commit_message>
<xml_diff>
--- a/manuscript/CRM_MANUSCRIPT_v1.5.docx
+++ b/manuscript/CRM_MANUSCRIPT_v1.5.docx
@@ -768,12 +768,12 @@
     </w:p>
     <w:p>
       <w:r>
-        <w:t>Matched STATE targets supported the direction of the GEARS transfer-degradation signal, although the evidence was smaller and endpoint-specific (Figure 5). Across 15 shared targets, audit-delta Pearson decreased from 0.2955 within context to 0.1792 cross context, for a mean drop of 0.1163 and a 95% interval of [0.0684, 0.1599]. Spearman decreased by 0.0709 and cosine decreased by 0.1048. Sign-flip rate was worse cross context, while the UER50 interval crossed zero. Leave-one-target-out sensitivity showed positive Pearson, Spearman, and cosine drops after omitting each of the 15 matched targets, indicating that the agreement-endpoint signal was not driven by one target.</w:t>
+        <w:t>Matched STATE targets supported the direction of the GEARS transfer-degradation signal, although the evidence was smaller and endpoint-specific (Figure 5). Across 15 shared targets, audit-delta Pearson decreased from 0.2955 within context to 0.1792 cross context, for a mean drop of 0.1163 and a 95% interval of [0.0684, 0.1599]. Spearman and cosine showed direction-aligned cross-context deterioration effects of 0.0709 and 0.1048. Sign-flip rate also worsened cross context, while the UER50 interval included zero after direction alignment for burden endpoints. Leave-one-target-out sensitivity showed positive Pearson, Spearman, and cosine drops after omitting each of the 15 matched targets, indicating that the agreement-endpoint signal was not driven by one target.</w:t>
       </w:r>
     </w:p>
     <w:p>
       <w:r>
-        <w:t>The independent STATE analysis therefore supports the direction of matched-target transfer degradation but does not establish architecture-level generality. In full-summary comparisons, STATE R-L4 had higher retrieval MRR than STATE R-L1 in a smaller normalized target universe. In the v1.3 common-candidate sensitivity using the same 15 matched targets as candidates, MRR was 0.2594 for within-context STATE and 0.2212 for cross-context STATE. VirtualPerturb-Audit records this as partial cross-architecture support with endpoint heterogeneity.</w:t>
+        <w:t>The independent STATE analysis therefore supports the direction of matched-target transfer degradation but does not establish architecture-level generality. In full-summary comparisons, STATE R-L4 had higher retrieval MRR than STATE R-L1 in a smaller normalized target universe. In the common-candidate sensitivity using the same 15 matched targets as candidates, MRR was 0.2594 for within-context STATE and 0.2212 for cross-context STATE, giving weaker endpoint-specific support than the agreement metrics. VirtualPerturb-Audit records this as partial cross-architecture support with endpoint heterogeneity.</w:t>
       </w:r>
     </w:p>
     <w:p>
@@ -1360,7 +1360,7 @@
     </w:p>
     <w:p>
       <w:r>
-        <w:t>Figure 5. STATE shows partial cross-architecture transfer degradation with endpoint heterogeneity. STATE K562-to-RPE1 matched targets (n=15) show lower cross-context audit-delta Pearson, Spearman, and cosine. UER50 has an interval crossing zero, sign-flip rate is worse cross context, and common-candidate retrieval from frozen centroids is reported as an exploratory sensitivity panel.</w:t>
+        <w:t>Figure 5. STATE provides partial cross-architecture support with endpoint heterogeneity. Matched K562-to-RPE1 STATE predictions were evaluated across 15 shared perturbation targets. (A) Effect directions were aligned for visualization so that positive values consistently indicate deterioration under cross-context prediction: within-minus-cross differences are shown for agreement endpoints, whereas cross-minus-within differences are shown for burden endpoints. Audit-delta Pearson, Spearman agreement, cosine agreement, and sign-flip rate showed directionally worse cross-context behavior, whereas the UER50 interval included zero. (B) In an exploratory common-candidate retrieval sensitivity using the same 15 perturbation candidates, MRR was 0.259 within context and 0.221 cross context. Together, these endpoints support partial rather than uniform cross-architecture transfer degradation. UER50 is an internal sensitivity endpoint rather than replicate-validated biological ground truth.</w:t>
       </w:r>
     </w:p>
     <w:sectPr>

</xml_diff>